<commit_message>
WC/2024/227: no Report B — 9A para 1.11 (oral treating evidence, notice given); oral medical evidence plan; forecast addendum
Co-Authored-By: Claude Fable 5.1 <noreply@anthropic.com>
Claude-Session: https://claude.ai/code/session_01PbSZiMB1koFR46V5hQyVcy
</commit_message>
<xml_diff>
--- a/wc2024227/drafts/second-amended-9A/2026-09-27_SECOND_AMENDED_9A_draft_v2.docx
+++ b/wc2024227/drafts/second-amended-9A/2026-09-27_SECOND_AMENDED_9A_draft_v2.docx
@@ -308,6 +308,20 @@
           <w:sz w:val="17"/>
         </w:rPr>
         <w:t>Particulars: paragraphs 261 to 262 of the notice to admit facts served 28 August 2026, admitted 8 September 2026.</w:t>
+      </w:r>
+    </w:p>
+    <w:p>
+      <w:pPr>
+        <w:keepLines w:val="0"/>
+      </w:pPr>
+      <w:r>
+        <w:rPr>
+          <w:b/>
+        </w:rPr>
+        <w:t xml:space="preserve">1.11 The medical evidence at hearing.</w:t>
+      </w:r>
+      <w:r>
+        <w:t xml:space="preserve"> No medico-legal report has been, or will be, prepared for this proceeding. The Appellant relies on the treating records and documents at Tabs M1 to M4 and M7 to M9, served with the Schedule of Medical Documents Relied Upon on 9 September 2026, and on the oral evidence of the treating general practitioner, Dr Peter Hawes, and the treating psychiatrist, Dr Ravikumar Bangalore Krishnaiah, each named in the Appellant's list of witnesses filed 9 September 2026. Each will be asked to address, from his own records and the admitted facts put to him: the diagnosis; the history reported to him and when; whether the Appellant's employment, and in particular the matters pleaded at Stressors 1 to 3, was a significant contributing factor to the injury; and the non-employment matters recorded in the report of 13 February 2025. Notice of that evidence is given by this paragraph. The Appellant will apply, once hearing dates are set, for attendance notices and for leave for each practitioner to give evidence by telephone or video link at a fixed time.</w:t>
       </w:r>
     </w:p>
     <w:p>

</xml_diff>

<commit_message>
WC/2024/227: 9A v2 — disclaimers of connection removed from 1(n), 1(o), 1(q); facts stated without inference
Co-Authored-By: Claude Fable 5.1 <noreply@anthropic.com>
Claude-Session: https://claude.ai/code/session_01PbSZiMB1koFR46V5hQyVcy
</commit_message>
<xml_diff>
--- a/wc2024227/drafts/second-amended-9A/2026-09-27_SECOND_AMENDED_9A_draft_v2.docx
+++ b/wc2024227/drafts/second-amended-9A/2026-09-27_SECOND_AMENDED_9A_draft_v2.docx
@@ -1041,7 +1041,7 @@
         <w:t>(n) Public interest disclosure - chronology only.</w:t>
       </w:r>
       <w:r>
-        <w:t xml:space="preserve"> On 13 May 2024 the Appellant lodged a corrupt conduct complaint regarding clinical risks. The Ethical Standards Unit formally determined this constituted a Public Interest Disclosure (Admitted Fact: Form 24, para 20, admitted 18 February 2026). The content is not set out. No connection between that disclosure and any later conduct is alleged or relied upon in this appeal.</w:t>
+        <w:t xml:space="preserve"> On 13 May 2024 the Appellant lodged a corrupt conduct complaint regarding clinical risks. The Ethical Standards Unit formally determined this constituted a Public Interest Disclosure (Admitted Fact: Form 24, para 20, admitted 18 February 2026). The content is not set out.</w:t>
       </w:r>
     </w:p>
     <w:p>
@@ -1071,14 +1071,6 @@
         <w:keepLines w:val="0"/>
       </w:pPr>
       <w:r>
-        <w:t>No allegation concerning the employer's conduct in relation to that endorsement is made in this appeal.</w:t>
-      </w:r>
-    </w:p>
-    <w:p>
-      <w:pPr>
-        <w:keepLines w:val="0"/>
-      </w:pPr>
-      <w:r>
         <w:rPr>
           <w:b/>
         </w:rPr>
@@ -1115,7 +1107,7 @@
         <w:t>(q) Matters pleaded as context only.</w:t>
       </w:r>
       <w:r>
-        <w:t xml:space="preserve"> The Respondent does not allege that the Appellant was subject to any disciplinary process, or that his work performance was the subject of any formal performance management process, before 18 June 2024, nor does it describe any communication with him before that date as a warning. [¶¶ 300 to 302] The matters at (j), (k), (l), (m), (n) and (o) above, and at paragraph 3 below, are pleaded as part of the sequence of matters the Appellant raised and the responses he received. They are not relied upon as independent causative circumstances within Stressor 1, and no connection between any of them and any other conduct is alleged. Where an admitted fact from that sequence is separately repeated under Stressor 2 or Stressor 3, it is relied upon there only for the distinct function stated under that stressor. The causative circumstances relied upon in Stressor 1 are those at (a) to (i) and (p).</w:t>
+        <w:t xml:space="preserve"> The Respondent does not allege that the Appellant was subject to any disciplinary process, or that his work performance was the subject of any formal performance management process, before 18 June 2024, nor does it describe any communication with him before that date as a warning. [¶¶ 300 to 302] The matters at (j), (k), (l), (m), (n) and (o) above, and at paragraph 3 below, are pleaded as part of the sequence of matters the Appellant raised and the responses he received. They are not relied upon as independent causative circumstances within Stressor 1. Where an admitted fact from that sequence is separately repeated under Stressor 2 or Stressor 3, it is relied upon there only for the distinct function stated under that stressor. The causative circumstances relied upon in Stressor 1 are those at (a) to (i) and (p).</w:t>
       </w:r>
     </w:p>
     <w:p>

</xml_diff>

<commit_message>
WC/2024/227: 9A v2 — Part F costs (s 558(3); Reg 2025 s 191 incl. 1.5x under s 191(3); s 192 medical-witness top-up)
Co-Authored-By: Claude Fable 5.1 <noreply@anthropic.com>
Claude-Session: https://claude.ai/code/session_01PbSZiMB1koFR46V5hQyVcy
</commit_message>
<xml_diff>
--- a/wc2024227/drafts/second-amended-9A/2026-09-27_SECOND_AMENDED_9A_draft_v2.docx
+++ b/wc2024227/drafts/second-amended-9A/2026-09-27_SECOND_AMENDED_9A_draft_v2.docx
@@ -2539,10 +2539,108 @@
         <w:rPr>
           <w:b/>
         </w:rPr>
-        <w:t>6.</w:t>
-      </w:r>
-      <w:r>
-        <w:t xml:space="preserve"> Costs reserved.</w:t>
+        <w:t xml:space="preserve">6.</w:t>
+      </w:r>
+      <w:r>
+        <w:t xml:space="preserve"> That the Respondent pay the Appellant's costs of the appeal under section 558(3) of the Act and section 191 of the Workers' Compensation and Rehabilitation Regulation 2025, including an award under section 191(3) of up to 1.5 times the amounts under section 191(2)(a), to be assessed failing agreement; alternatively, that costs be reserved.</w:t>
+      </w:r>
+    </w:p>
+    <w:p>
+      <w:pPr>
+        <w:keepNext/>
+        <w:spacing w:before="120" w:after="60"/>
+      </w:pPr>
+      <w:r>
+        <w:rPr>
+          <w:rFonts w:ascii="Arial" w:hAnsi="Arial"/>
+          <w:b/>
+          <w:sz w:val="21"/>
+        </w:rPr>
+        <w:t xml:space="preserve">PART F - COSTS</w:t>
+      </w:r>
+    </w:p>
+    <w:p>
+      <w:pPr>
+        <w:keepLines w:val="0"/>
+      </w:pPr>
+      <w:r>
+        <w:rPr>
+          <w:b/>
+        </w:rPr>
+        <w:t xml:space="preserve">1.</w:t>
+      </w:r>
+      <w:r>
+        <w:t xml:space="preserve"> Costs of the hearing are in the Commission's discretion: section 558(3) of the Act; section 191(1) of the Workers' Compensation and Rehabilitation Regulation 2025. Costs ordinarily follow the event.</w:t>
+      </w:r>
+    </w:p>
+    <w:p>
+      <w:pPr>
+        <w:keepLines w:val="0"/>
+      </w:pPr>
+      <w:r>
+        <w:rPr>
+          <w:b/>
+        </w:rPr>
+        <w:t xml:space="preserve">2.</w:t>
+      </w:r>
+      <w:r>
+        <w:t xml:space="preserve"> If the appeal is allowed, the Appellant will seek an order that the Respondent pay his costs of the appeal, assessed under section 191(2): (a) counsel's or solicitor's fees, for any period in which the Appellant is legally represented, at the costs stated in the Uniform Civil Procedure Rules 1999, schedule 2, part 2, scale C; (b) costs in relation to witnesses at the allowances stated in the Uniform Civil Procedure (Fees) Regulation 2019, part 3, including the fees and expenses of the medical practitioners called under paragraph B.1.11; and (c) any costs in relation to bailiffs.</w:t>
+      </w:r>
+    </w:p>
+    <w:p>
+      <w:pPr>
+        <w:keepLines w:val="0"/>
+      </w:pPr>
+      <w:r>
+        <w:rPr>
+          <w:b/>
+        </w:rPr>
+        <w:t xml:space="preserve">3.</w:t>
+      </w:r>
+      <w:r>
+        <w:t xml:space="preserve"> The Appellant will contend that the amounts under section 191(2)(a) are inadequate and will seek an award of up to 1.5 times those amounts under section 191(3), in total or in relation to any item, having regard to: (a) the work involved, being a record of 303 facts of which 298 are admitted, the documents at Annexure A to the notice to admit, non-party disclosure obtained under rule 64G, two notices to admit facts and a notice to admit documents, and the outlines of four witnesses served by the Respondent; and (b) the importance, difficulty and complexity of the matter, being an appeal concerning a psychological injury under section 32(5)(a) which requires the classification of each circumstance pleaded, a finding on the reasonableness of each that is management action, and the weighing of the whole.</w:t>
+      </w:r>
+    </w:p>
+    <w:p>
+      <w:pPr>
+        <w:keepLines w:val="0"/>
+      </w:pPr>
+      <w:r>
+        <w:rPr>
+          <w:b/>
+        </w:rPr>
+        <w:t xml:space="preserve">4.</w:t>
+      </w:r>
+      <w:r>
+        <w:t xml:space="preserve"> On the exercise of the discretion under section 558(3), the Appellant will also rely on the course of the proceeding, including that paragraph 27 of the Respondent's amended statement of facts and contentions identifies no management action [¶ 303], that the Respondent has notified no medical or expert evidence (Part B.6.5), and that the Respondent's own review decision found the rostering of 17 and 18 March 2024 to be unreasonable management action [¶ 260].</w:t>
+      </w:r>
+    </w:p>
+    <w:p>
+      <w:pPr>
+        <w:keepLines w:val="0"/>
+      </w:pPr>
+      <w:r>
+        <w:rPr>
+          <w:b/>
+        </w:rPr>
+        <w:t xml:space="preserve">5.</w:t>
+      </w:r>
+      <w:r>
+        <w:t xml:space="preserve"> To the extent that the fees and expenses payable to a medical practitioner, or to any witness who gives evidence of a professional nature, exceed the costs awarded in relation to that witness, the Appellant will apply to the Respondent under section 192 of the Regulation for payment of an additional amount.</w:t>
+      </w:r>
+    </w:p>
+    <w:p>
+      <w:pPr>
+        <w:keepLines w:val="0"/>
+      </w:pPr>
+      <w:r>
+        <w:rPr>
+          <w:b/>
+        </w:rPr>
+        <w:t xml:space="preserve">6.</w:t>
+      </w:r>
+      <w:r>
+        <w:t xml:space="preserve"> The Appellant reserves the right to rely, on the question of costs, on any offer made without prejudice save as to costs.</w:t>
       </w:r>
     </w:p>
     <w:p>

</xml_diff>

<commit_message>
WC/2024/227: 9A v2 — Stressor 3(h) register entries 17-19 Mar (not admitted, to be proved), code meanings, call load and the Monday; Award cl 15.1(d); FRMS guideline extracts in 3(l)(i)
Co-Authored-By: Claude Fable 5.1 <noreply@anthropic.com>
Claude-Session: https://claude.ai/code/session_01PbSZiMB1koFR46V5hQyVcy
</commit_message>
<xml_diff>
--- a/wc2024227/drafts/second-amended-9A/2026-09-27_SECOND_AMENDED_9A_draft_v2.docx
+++ b/wc2024227/drafts/second-amended-9A/2026-09-27_SECOND_AMENDED_9A_draft_v2.docx
@@ -599,6 +599,14 @@
         <w:keepLines w:val="0"/>
       </w:pPr>
       <w:r>
+        <w:t xml:space="preserve">The Appellant will give evidence that the console took in the order of 270 to 440 calls on an eight-hour shift, and that emergency codes were received and paged through it throughout the day (Stressor 3(h) below). That evidence is his own and is not admitted.</w:t>
+      </w:r>
+    </w:p>
+    <w:p>
+      <w:pPr>
+        <w:keepLines w:val="0"/>
+      </w:pPr>
+      <w:r>
         <w:t>On 3 May 2024 at 3:06 pm the MASPER Registrar wrote to the Switchboard Manager with the subject "Switchboard issues 2nd and 3rd May 2024", listing five occasions on 2 and 3 May. [¶¶ 56 to 57] Of the occasion at 14:46 on 3 May the email records: "MET call team called x5290 asking where MET call was located 'VHUB' switchboard could not tell them where VHUB was. Had to be redirected by MASPER". [¶ 58]</w:t>
       </w:r>
     </w:p>
@@ -1557,6 +1565,14 @@
         <w:keepLines w:val="0"/>
       </w:pPr>
       <w:r>
+        <w:t xml:space="preserve">The Award itself, clause 15.1(d), provides: "Employees must be allowed a break of not less than 10 hours between the termination of one shift and the commencement of another shift, except that 8 hours applies instead of the 10 hours in any of the following circumstances: (i) for the purposes of changing shift rosters by shift workers who rotate from one shift to another; or (ii) in any other case agreed upon between the employer and the employee concerned." Clause 18.10, on which the Respondent relies at paragraph 24(b) of its statement [¶ 237], is headed "Fatigue leave/rest period after overtime" and applies where overtime is worked. [Hospital and Health Service General Employees (Queensland Health) Award - State 2015]</w:t>
+      </w:r>
+    </w:p>
+    <w:p>
+      <w:pPr>
+        <w:keepLines w:val="0"/>
+      </w:pPr>
+      <w:r>
         <w:t>On 18 February 2026 the Respondent admitted that "The Employer's 'Fatigue Risk Management Policy' and the relevant Award require a minimum break of 10 hours between shifts, or 8 hours by written agreement". [¶ 285] It denied a further paragraph of that notice on the ground that in June 2020 the Appellant signed an agreement allowing an 8-hour break between shifts. [¶ 286]</w:t>
       </w:r>
     </w:p>
@@ -1598,10 +1614,76 @@
         <w:rPr>
           <w:b/>
         </w:rPr>
-        <w:t>(h) The employer's own record of emergency workload.</w:t>
-      </w:r>
-      <w:r>
-        <w:t xml:space="preserve"> Metro South Health has stated in writing that "a spreadsheet of recorded MET calls is available for the period 17-18 March 2024". [¶ 268] The specific register entries put in facts 228 to 231 are not relied upon here as admissions because those facts were not admitted. If the register is relied upon at hearing, its contents will be proved separately.</w:t>
+        <w:t xml:space="preserve">(h) The emergency workload on those shifts.</w:t>
+      </w:r>
+      <w:r>
+        <w:t xml:space="preserve"> Metro South Health has stated in writing that "a spreadsheet of recorded MET calls is available for the period 17-18 March 2024". [¶ 268] A key responsibility of the position is to participate in the Emergency Response process by receiving emergency response notifications and distributing them to the appropriate response groups, dependent on the category of emergency, as per emergency code procedures, strictly adhering to protocols and timeframes; and to support the allocation, coordination and fault repair of all pager units for the hospital. [¶¶ 7 to 8] The Switchboard staff are, on the employer's own statement, non-clinical. [¶ 265]</w:t>
+      </w:r>
+    </w:p>
+    <w:p>
+      <w:pPr>
+        <w:keepLines w:val="0"/>
+      </w:pPr>
+      <w:r>
+        <w:rPr>
+          <w:b/>
+        </w:rPr>
+        <w:t xml:space="preserve">(h)(i) The register: not admitted, to be proved.</w:t>
+      </w:r>
+      <w:r>
+        <w:t xml:space="preserve"> The matters in this sub-paragraph are taken from the document at Tab 31 to the notice to admit, the "2024 Emergency Code Register" (March 2024 sheet), and from the Appellant's own records. The Respondent did not admit paragraphs 228 to 231 of that notice. They are not relied upon as admissions. The Appellant will prove them at hearing by tendering the register, by the employer's spreadsheet referred to at [¶ 268], and by his own evidence as the operator.</w:t>
+      </w:r>
+    </w:p>
+    <w:p>
+      <w:pPr>
+        <w:keepLines w:val="0"/>
+      </w:pPr>
+      <w:r>
+        <w:t xml:space="preserve">On the Appellant's reading of that register, it records for 17 March 2024, the shift that ended at 23:00 [¶ 284], the following entries: 3:57 Code Grey, ED lounge; 5:19 MET call, Ward 5A bed 27; 7:48 Code Grey, ED corridor near short stay; 13:48 MET call, Ward 3B bed 2; 14:13 Code Grey, ED adult acute bed 15; 19:16 MET call, Ward 2H bed 7; 19:20 Code Blue, Ward 2H bed 7; 21:16 MET call, Ward 2Q bed 5. Eight entries in the day; three of them, including the Code Blue, in the evening of the shift ending at 23:00.</w:t>
+      </w:r>
+    </w:p>
+    <w:p>
+      <w:pPr>
+        <w:keepLines w:val="0"/>
+      </w:pPr>
+      <w:r>
+        <w:t xml:space="preserve">For 18 March 2024, the shift that began at 06:00 [¶ 284]: 8:48 Code Grey, QAS triage airlock; 9:20 MET call, Ward 6A bed 8; 11:31 MET call, Ward 3DR bed 14; 11:32 cancelled MET call, Ward 3DR bed 14; 11:35 Neonatal MET call, Theatre 2; 13:09 Neonatal MET call, Birth Suites 5; 14:38 MET call, Ward 3DR bed 11; 14:45 and 14:55 Code Grey, QAS triage; 19:15 and 19:34 Code Grey, ED QAS ramp. Eleven entries in the day; six between 06:00 and 14:00, including two neonatal MET calls.</w:t>
+      </w:r>
+    </w:p>
+    <w:p>
+      <w:pPr>
+        <w:keepLines w:val="0"/>
+      </w:pPr>
+      <w:r>
+        <w:t xml:space="preserve">For 19 March 2024, the day on which 7.60 hours of sick leave was taken [¶ 235]: 0:17 MET call, Ward MIU bed 21; 1:41 Code Grey, ED ambulatory care; 9:27 Paediatric MET call, Ward CIU bed 16; 10:28 simulation MET call, Ward 7C bed 3; 11:30 MET call, Ward 2I bed 20; 11:34 MET call, Ward 2I bed 20, annotated "CALLED VIA SWITRCHBOARD" [sic]; 12:36 MET call, Ward 2I bed 12; 13:42 MET call, Ward 3DR bed 11; 16:28 MET call, Ward 3DR bed 11, cancelled at 16:29; 16:48 Code Grey, ED mental health lounge; 17:23 MET call, Ward 3DR bed 11; 17:31 Code Grey, ED ambulatory care room 2; 18:45 MET call, Ward 5B bed 7; 21:28 Code Grey, ED mental health lounge; 22:25 Code Grey, ED QAS triage. Sixteen entries in the day; between 06:00 and 14:00, six, of which five were MET calls, one of them recorded as called through the Switchboard.</w:t>
+      </w:r>
+    </w:p>
+    <w:p>
+      <w:pPr>
+        <w:keepLines w:val="0"/>
+      </w:pPr>
+      <w:r>
+        <w:rPr>
+          <w:b/>
+        </w:rPr>
+        <w:t xml:space="preserve">(h)(ii) What the codes are.</w:t>
+      </w:r>
+      <w:r>
+        <w:t xml:space="preserve"> The role description requires the codes to be handled "as per emergency code procedures". [¶ 8] Those procedures are Logan Hospital documents; they are not in the Respondent's List of Documents and will be called for. Pending their production, the Appellant will give evidence, as the operator who activated them, that at Logan Hospital in March 2024: a Code Blue was the call for a medical emergency in which a patient had suffered or was about to suffer cardiac or respiratory arrest, requiring the immediate attendance of the resuscitation team; a MET call was the call for the Medical Emergency Team to attend a deteriorating patient meeting the hospital's escalation criteria, with Neonatal and Paediatric MET calls for newborn and child patients; a Code Grey was the call for a security response to threatening or aggressive behaviour; and a Code Black was the call for a security response to a personal threat. Each code was received at the Switchboard, categorised by the operator, and paged to the response group for that category within the timeframe fixed by the procedure. The Australian Standard on which hospital emergency codes are based, AS 4083, uses the same colour scheme.</w:t>
+      </w:r>
+    </w:p>
+    <w:p>
+      <w:pPr>
+        <w:keepLines w:val="0"/>
+      </w:pPr>
+      <w:r>
+        <w:rPr>
+          <w:b/>
+        </w:rPr>
+        <w:t xml:space="preserve">(h)(iii) The ordinary call load, and the Monday.</w:t>
+      </w:r>
+      <w:r>
+        <w:t xml:space="preserve"> The Appellant will give evidence, from his own monthly call statistics, that in the period of his graduated return in April 2025 he took between 269 and 444 calls on a single eight-hour shift, an average of about 360, and that the highest figure, 444, was on the one Monday afternoon shift in that sample (14 April 2025). He will give evidence that the Monday early shift is the peak of the week, because the weekend's backlog, the resumption of clinics and elective lists and the Monday admissions all arrive at the console together. The shift of 18 March 2024 was the Monday early shift, the first shift of the working week [¶ 227], and it followed a break of seven hours [¶ 284]. These matters are not admitted; they are the Appellant's own evidence and records, and will be proved by him.</w:t>
       </w:r>
     </w:p>
     <w:p>
@@ -1714,6 +1796,44 @@
       </w:r>
       <w:r>
         <w:t xml:space="preserve"> By letter of 5 June 2026, reference K-LM26/729, signed by the Chief Executive and addressed to the Commission, Metro South Health stated that the requested fatigue risk management documents "do not exist", that mandatory Fatigue Risk Management System training "only applies to health practitioners and clinical assistants" and that Switchboard staff are non-clinical. [¶¶ 263, 265] It stated that "The implementation of fatigue risk management assessment at Switchboard Logan Hospital occurred after 30 June 2024". [¶ 264] It stated that "there have been no 'consequential' changes to operating procedures over the period requested". [¶ 266] The Respondent does not allege that any fatigue risk assessment was conducted, that fatigue risk management training was provided, that fatigue risk management assessment was implemented at the Switchboard, or that any change was made to the operating procedures of the Switchboard as a consequence of any employee complaint, at any time before 30 June 2024. [¶¶ 269 to 272]</w:t>
+      </w:r>
+    </w:p>
+    <w:p>
+      <w:pPr>
+        <w:keepLines w:val="0"/>
+      </w:pPr>
+      <w:r>
+        <w:rPr>
+          <w:b/>
+        </w:rPr>
+        <w:t xml:space="preserve">(l)(i) The employer's own fatigue guideline.</w:t>
+      </w:r>
+      <w:r>
+        <w:t xml:space="preserve"> On 20 May 2024 the Director sent Human Resources the Queensland Health Fatigue Risk Management Systems Implementation Guideline, qh-gdl-401-3.3. [¶¶ 222 to 223] Ten days earlier she had written that she and the Manager had run through the Roster Risk Assessment Matrix and "we say at best there would be a rating of 11 which is moderate". [¶ 219] The Respondent disclosed the guideline, with that email chain, on 14 July 2025 (Tab 8A). The following passages are from that disclosed copy.</w:t>
+      </w:r>
+    </w:p>
+    <w:p>
+      <w:pPr>
+        <w:keepLines w:val="0"/>
+      </w:pPr>
+      <w:r>
+        <w:t xml:space="preserve">The guideline defines fatigue as "A state of impaired physical and/or mental performance and lowered alertness arising as a result or combination of physical and mental work, health and psychosocial factors or inadequate restorative sleep", and a fatigue risk management system as "An integrated set of management practices and procedures for monitoring and managing the risks posed to health, safety and wellbeing by fatigue". It defines "Defences in depth" as a "Hazard identification and risk control model that applies a series of layered mechanisms to minimise the occurrence of fatigue related incidents". [Guideline, glossary, p 29]</w:t>
+      </w:r>
+    </w:p>
+    <w:p>
+      <w:pPr>
+        <w:keepLines w:val="0"/>
+      </w:pPr>
+      <w:r>
+        <w:t xml:space="preserve">It provides that "Level 4 controls relate to error tolerance and containment" and that "Error tolerance relates to built-in redundancies that decrease the likelihood that a fatigued individual will make an error which may have catastrophic consequences." [p 21] It provides that "workers should be encouraged to report fatigue via the organisation's incident management system or other relevant hazard or incident reporting channels", and that reporting fatigue may constitute "a situation where a worker has identified that they are suffering from fatigue due to work-related factors". [p 22] It provides that determining whether fatigue contributed to an incident "is reliant on evidence such as rostering information, actual hours worked, fatigue leave, fatigue self-assessment scores and reporting of fatigue hazards". [p 23] It lists among performance indicators "fatigue risk management training compliance levels" and "payroll data (fatigue leave and overtime accessed)". [p 24, section 6.1] It lists among its related documents the Hospital and Health Services General Employees (Queensland Health) Award - State 2015 and the "I1 (QH-POL-171) Fatigue risk management policy". [p 28]</w:t>
+      </w:r>
+    </w:p>
+    <w:p>
+      <w:pPr>
+        <w:keepLines w:val="0"/>
+      </w:pPr>
+      <w:r>
+        <w:t xml:space="preserve">The guideline the Director sent to Human Resources on 20 May 2024 is the guideline the Chief Executive's letter of 5 June 2026 says was implemented at the Switchboard only "after 30 June 2024" [¶ 264], and the training for which "only applies to health practitioners and clinical assistants" [¶ 265]. The fatigue risk of the Appellant's roster had been assessed by the Director and the Manager as moderate on 10 May 2024 [¶ 219]; no fatigue risk assessment of his position is alleged to have been conducted before 30 June 2024 [¶ 269].</w:t>
       </w:r>
     </w:p>
     <w:p>

</xml_diff>

<commit_message>
WC/2024/227: 9A v2 — remaining FRMS guideline content pleaded page by page in 3(l)(i) (consultation/training, supporting docs, definitions, Neville Report reference)
Co-Authored-By: Claude Fable 5.1 <noreply@anthropic.com>
Claude-Session: https://claude.ai/code/session_01PbSZiMB1koFR46V5hQyVcy
</commit_message>
<xml_diff>
--- a/wc2024227/drafts/second-amended-9A/2026-09-27_SECOND_AMENDED_9A_draft_v2.docx
+++ b/wc2024227/drafts/second-amended-9A/2026-09-27_SECOND_AMENDED_9A_draft_v2.docx
@@ -1826,6 +1826,30 @@
       </w:pPr>
       <w:r>
         <w:t xml:space="preserve">It provides that "Level 4 controls relate to error tolerance and containment" and that "Error tolerance relates to built-in redundancies that decrease the likelihood that a fatigued individual will make an error which may have catastrophic consequences." [p 21] It provides that "workers should be encouraged to report fatigue via the organisation's incident management system or other relevant hazard or incident reporting channels", and that reporting fatigue may constitute "a situation where a worker has identified that they are suffering from fatigue due to work-related factors". [p 22] It provides that determining whether fatigue contributed to an incident "is reliant on evidence such as rostering information, actual hours worked, fatigue leave, fatigue self-assessment scores and reporting of fatigue hazards". [p 23] It lists among performance indicators "fatigue risk management training compliance levels" and "payroll data (fatigue leave and overtime accessed)". [p 24, section 6.1] It lists among its related documents the Hospital and Health Services General Employees (Queensland Health) Award - State 2015 and the "I1 (QH-POL-171) Fatigue risk management policy". [p 28]</w:t>
+      </w:r>
+    </w:p>
+    <w:p>
+      <w:pPr>
+        <w:keepLines w:val="0"/>
+      </w:pPr>
+      <w:r>
+        <w:t xml:space="preserve">On consultation and training, the guideline states: "there is a legislative obligation to consult with workers in relation to hazard identification and the making of decisions about how associated risks can be managed. Consultation requirements for Queensland Health are described in Health, safety and wellbeing consultation standard (QH-IMP-401-2:2020)." It states that information, training and instruction "must have regard for: the nature of the work carried out; the nature of the risks associated with the work; the control measures implemented", and that "where a work unit or an occupational stream has been identified at risk of fatigue, the training provided must consider the above criteria". Its example training matrix (Figure 11) lists, as those to be trained, "Staff at risk of fatigue", "Rostering staff" and "Manager, supervisors, executives", with learning outcomes including "Rostering". [p 26, section 7.1] It states that successful implementation "relies strongly on effective communication", including "the training of relevant stakeholders so there is an understanding of the actions required of individuals to ensure the FRMS performs as intended". [p 25, section 7] It states that monitoring and assurance "can highlight situations where control measures may require modification" and provide "an opportunity to identify emerging issues and introduce new procedures and controls to mitigate risk". [p 25, section 6.2]</w:t>
+      </w:r>
+    </w:p>
+    <w:p>
+      <w:pPr>
+        <w:keepLines w:val="0"/>
+      </w:pPr>
+      <w:r>
+        <w:t xml:space="preserve">Its supporting documents include the "Fatigue risk assessment tool", the "Individual fatigue likelihood calculator", the "Samn-Perelli fatigue checklist", "Preventing and managing fatigue-related risk in the workplace (Workplace Health and Safety Queensland)", the Health, safety and wellbeing consultation standard (QH-IMP-401-2:2020), the Health, safety and wellbeing risk management standard (QH-IMP-401-3:2020) and the Health, safety and wellbeing policy (QH-POL-401:2020). [pp 27 to 28, section 9] Its legislation list includes the Work Health and Safety Act 2011, the Work Health and Safety Regulation 2011, and the "Managing the risk of work-related psychosocial hazards Code of Practice". [p 27, section 8] It defines a "Worker" by reference to section 7 of the WHS Act, including "An employee", and states that "The Department of Health and each of the HHSs are considered to be PCBUs". [pp 29 to 30, section 10] Its version control records that version 1.0 of 10 November 2021 replaced the "Fatigue Risk Management System Resource Pack December 2018 v. 3". [p 30, section 11] Its references include "Queensland Ombudsman (2006). The Neville Report" and Ziebertz and others (2015) on "The Relationship of on-call work with fatigue, work-home interference, and perceived performance difficulties". [pp 30 to 31, section 12] Each page of the disclosed copy carries the footer "Managing the risk of psychosocial hazards at work Code of Practice 2022 applies 1 April 2023".</w:t>
+      </w:r>
+    </w:p>
+    <w:p>
+      <w:pPr>
+        <w:keepLines w:val="0"/>
+      </w:pPr>
+      <w:r>
+        <w:t xml:space="preserve">The guideline therefore treated the Award under which the Appellant was employed as a supporting document, treated every employee of a Hospital and Health Service as a worker to whom it applied, called for consultation with workers on fatigue hazards, called for training of rostering staff and managers, and had been preceded by a resource pack since December 2018. The Chief Executive's letter states that fatigue risk management assessment at the Switchboard was implemented after 30 June 2024 and that the mandatory training "only applies to health practitioners and clinical assistants". [¶¶ 264 to 265] The Respondent does not allege that any fatigue risk management training was provided to the Appellant, or that any fatigue risk assessment of his position was conducted, before 30 June 2024. [¶¶ 269 to 270]</w:t>
       </w:r>
     </w:p>
     <w:p>

</xml_diff>

<commit_message>
WC/2024/227: 9A v2 — 3(h) rewritten: codes defined once, then each day's codes as documented by the Appellant; no 'pending production'
Co-Authored-By: Claude Fable 5.1 <noreply@anthropic.com>
Claude-Session: https://claude.ai/code/session_01PbSZiMB1koFR46V5hQyVcy
</commit_message>
<xml_diff>
--- a/wc2024227/drafts/second-amended-9A/2026-09-27_SECOND_AMENDED_9A_draft_v2.docx
+++ b/wc2024227/drafts/second-amended-9A/2026-09-27_SECOND_AMENDED_9A_draft_v2.docx
@@ -1628,34 +1628,10 @@
         <w:rPr>
           <w:b/>
         </w:rPr>
-        <w:t xml:space="preserve">(h)(i) The register: not admitted, to be proved.</w:t>
-      </w:r>
-      <w:r>
-        <w:t xml:space="preserve"> The matters in this sub-paragraph are taken from the document at Tab 31 to the notice to admit, the "2024 Emergency Code Register" (March 2024 sheet), and from the Appellant's own records. The Respondent did not admit paragraphs 228 to 231 of that notice. They are not relied upon as admissions. The Appellant will prove them at hearing by tendering the register, by the employer's spreadsheet referred to at [¶ 268], and by his own evidence as the operator.</w:t>
-      </w:r>
-    </w:p>
-    <w:p>
-      <w:pPr>
-        <w:keepLines w:val="0"/>
-      </w:pPr>
-      <w:r>
-        <w:t xml:space="preserve">On the Appellant's reading of that register, it records for 17 March 2024, the shift that ended at 23:00 [¶ 284], the following entries: 3:57 Code Grey, ED lounge; 5:19 MET call, Ward 5A bed 27; 7:48 Code Grey, ED corridor near short stay; 13:48 MET call, Ward 3B bed 2; 14:13 Code Grey, ED adult acute bed 15; 19:16 MET call, Ward 2H bed 7; 19:20 Code Blue, Ward 2H bed 7; 21:16 MET call, Ward 2Q bed 5. Eight entries in the day; three of them, including the Code Blue, in the evening of the shift ending at 23:00.</w:t>
-      </w:r>
-    </w:p>
-    <w:p>
-      <w:pPr>
-        <w:keepLines w:val="0"/>
-      </w:pPr>
-      <w:r>
-        <w:t xml:space="preserve">For 18 March 2024, the shift that began at 06:00 [¶ 284]: 8:48 Code Grey, QAS triage airlock; 9:20 MET call, Ward 6A bed 8; 11:31 MET call, Ward 3DR bed 14; 11:32 cancelled MET call, Ward 3DR bed 14; 11:35 Neonatal MET call, Theatre 2; 13:09 Neonatal MET call, Birth Suites 5; 14:38 MET call, Ward 3DR bed 11; 14:45 and 14:55 Code Grey, QAS triage; 19:15 and 19:34 Code Grey, ED QAS ramp. Eleven entries in the day; six between 06:00 and 14:00, including two neonatal MET calls.</w:t>
-      </w:r>
-    </w:p>
-    <w:p>
-      <w:pPr>
-        <w:keepLines w:val="0"/>
-      </w:pPr>
-      <w:r>
-        <w:t xml:space="preserve">For 19 March 2024, the day on which 7.60 hours of sick leave was taken [¶ 235]: 0:17 MET call, Ward MIU bed 21; 1:41 Code Grey, ED ambulatory care; 9:27 Paediatric MET call, Ward CIU bed 16; 10:28 simulation MET call, Ward 7C bed 3; 11:30 MET call, Ward 2I bed 20; 11:34 MET call, Ward 2I bed 20, annotated "CALLED VIA SWITRCHBOARD" [sic]; 12:36 MET call, Ward 2I bed 12; 13:42 MET call, Ward 3DR bed 11; 16:28 MET call, Ward 3DR bed 11, cancelled at 16:29; 16:48 Code Grey, ED mental health lounge; 17:23 MET call, Ward 3DR bed 11; 17:31 Code Grey, ED ambulatory care room 2; 18:45 MET call, Ward 5B bed 7; 21:28 Code Grey, ED mental health lounge; 22:25 Code Grey, ED QAS triage. Sixteen entries in the day; between 06:00 and 14:00, six, of which five were MET calls, one of them recorded as called through the Switchboard.</w:t>
+        <w:t xml:space="preserve">(h)(i) The codes.</w:t>
+      </w:r>
+      <w:r>
+        <w:t xml:space="preserve"> Each emergency code at Logan Hospital is received at the Switchboard, categorised by the operator by the type of emergency, and paged to the response group for that category within the time the procedure allows. [¶ 8] A Code Blue is the call for a medical emergency in which a patient has suffered, or is about to suffer, cardiac or respiratory arrest, and brings the resuscitation team. A MET call is the call for the Medical Emergency Team to a patient whose observations have deteriorated to the hospital's escalation threshold; a Neonatal MET call and a Paediatric MET call are the same call for a newborn and for a child. A Code Grey is the call for a security response to threatening or aggressive behaviour; a Code Black is the call for a security response to a personal threat. The colour codes follow the Australian Standard for emergency control in health care facilities, AS 4083.</w:t>
       </w:r>
     </w:p>
     <w:p>
@@ -1666,10 +1642,10 @@
         <w:rPr>
           <w:b/>
         </w:rPr>
-        <w:t xml:space="preserve">(h)(ii) What the codes are.</w:t>
-      </w:r>
-      <w:r>
-        <w:t xml:space="preserve"> The role description requires the codes to be handled "as per emergency code procedures". [¶ 8] Those procedures are Logan Hospital documents; they are not in the Respondent's List of Documents and will be called for. Pending their production, the Appellant will give evidence, as the operator who activated them, that at Logan Hospital in March 2024: a Code Blue was the call for a medical emergency in which a patient had suffered or was about to suffer cardiac or respiratory arrest, requiring the immediate attendance of the resuscitation team; a MET call was the call for the Medical Emergency Team to attend a deteriorating patient meeting the hospital's escalation criteria, with Neonatal and Paediatric MET calls for newborn and child patients; a Code Grey was the call for a security response to threatening or aggressive behaviour; and a Code Black was the call for a security response to a personal threat. Each code was received at the Switchboard, categorised by the operator, and paged to the response group for that category within the timeframe fixed by the procedure. The Australian Standard on which hospital emergency codes are based, AS 4083, uses the same colour scheme.</w:t>
+        <w:t xml:space="preserve">(h)(ii) The codes on the shift of 17 March 2024, as documented by the Appellant.</w:t>
+      </w:r>
+      <w:r>
+        <w:t xml:space="preserve"> The shift ended at 23:00. [¶ 284] The Emergency Code Register for that day (Tab 31) records eight codes: at 3:57 a Code Grey in the ED lounge; at 5:19 a MET call to Ward 5A bed 27; at 7:48 a Code Grey in the ED corridor near short stay; at 13:48 a MET call to Ward 3B bed 2; at 14:13 a Code Grey in ED adult acute bed 15; at 19:16 a MET call to Ward 2H bed 7; at 19:20, four minutes later, a Code Blue to the same patient, Ward 2H bed 7; and at 21:16 a MET call to Ward 2Q bed 5. The last three fell in the evening of that shift.</w:t>
       </w:r>
     </w:p>
     <w:p>
@@ -1680,7 +1656,43 @@
         <w:rPr>
           <w:b/>
         </w:rPr>
-        <w:t xml:space="preserve">(h)(iii) The ordinary call load, and the Monday.</w:t>
+        <w:t xml:space="preserve">(h)(iii) The codes on the shift of 18 March 2024, as documented by the Appellant.</w:t>
+      </w:r>
+      <w:r>
+        <w:t xml:space="preserve"> The shift began at 06:00, seven hours after the previous one ended. [¶ 284] The register records eleven codes that day: at 8:48 a Code Grey at the QAS triage airlock; at 9:20 a MET call to Ward 6A bed 8; at 11:31 a MET call to Ward 3DR bed 14, cancelled at 11:32; at 11:35 a Neonatal MET call to Theatre 2; at 13:09 a Neonatal MET call to Birth Suite 5; at 14:38 a MET call to Ward 3DR bed 11; at 14:45 and 14:55 Code Greys at QAS triage; and at 19:15 and 19:34 Code Greys on the ED QAS ramp. Six of those fell between 06:00 and 14:00: a Code Grey, three adult MET calls (one cancelled within a minute) and two Neonatal MET calls.</w:t>
+      </w:r>
+    </w:p>
+    <w:p>
+      <w:pPr>
+        <w:keepLines w:val="0"/>
+      </w:pPr>
+      <w:r>
+        <w:rPr>
+          <w:b/>
+        </w:rPr>
+        <w:t xml:space="preserve">(h)(iv) The codes on 19 March 2024, the day of the sick leave, as documented by the Appellant.</w:t>
+      </w:r>
+      <w:r>
+        <w:t xml:space="preserve"> Sick leave of 7.60 hours was taken that day. [¶ 235] The register records sixteen codes: at 0:17 a MET call to Ward MIU bed 21; at 1:41 a Code Grey in ED ambulatory care; at 9:27 a Paediatric MET call to Ward CIU bed 16; at 10:28 a simulation MET call to Ward 7C bed 3; at 11:30 a MET call to Ward 2I bed 20 and at 11:34 a MET call to the same bed, annotated "CALLED VIA SWITRCHBOARD" [sic]; at 12:36 a MET call to Ward 2I bed 12; at 13:42 a MET call to Ward 3DR bed 11; at 16:28 a MET call to Ward 3DR bed 11, cancelled at 16:29; at 16:48 a Code Grey in the ED mental health lounge; at 17:23 a MET call to Ward 3DR bed 11; at 17:31 a Code Grey in ED ambulatory care room 2; at 18:45 a MET call to Ward 5B bed 7; at 21:28 a Code Grey in the ED mental health lounge; and at 22:25 a Code Grey at ED QAS triage. Between 06:00 and 14:00 there were six: a Paediatric MET call, a simulation, and four adult MET calls, one of them recorded as called through the Switchboard.</w:t>
+      </w:r>
+    </w:p>
+    <w:p>
+      <w:pPr>
+        <w:keepLines w:val="0"/>
+      </w:pPr>
+      <w:r>
+        <w:t xml:space="preserve">Paragraphs 228 to 231 of the notice to admit were not admitted. The entries above are documented by the Appellant from the register at Tab 31 and from the employer's own record of MET calls for 17 and 18 March 2024 [¶ 268], and he will prove them.</w:t>
+      </w:r>
+    </w:p>
+    <w:p>
+      <w:pPr>
+        <w:keepLines w:val="0"/>
+      </w:pPr>
+      <w:r>
+        <w:rPr>
+          <w:b/>
+        </w:rPr>
+        <w:t xml:space="preserve">(h)(v) The ordinary call load, and the Monday.</w:t>
       </w:r>
       <w:r>
         <w:t xml:space="preserve"> The Appellant will give evidence, from his own monthly call statistics, that in the period of his graduated return in April 2025 he took between 269 and 444 calls on a single eight-hour shift, an average of about 360, and that the highest figure, 444, was on the one Monday afternoon shift in that sample (14 April 2025). He will give evidence that the Monday early shift is the peak of the week, because the weekend's backlog, the resumption of clinics and elective lists and the Monday admissions all arrive at the console together. The shift of 18 March 2024 was the Monday early shift, the first shift of the working week [¶ 227], and it followed a break of seven hours [¶ 284]. These matters are not admitted; they are the Appellant's own evidence and records, and will be proved by him.</w:t>

</xml_diff>

<commit_message>
WC/2024/227: 9A v2 — Part B.7: every Annexure A document with date and status (admitted / confirmed 23 Sep / referred to MSH / not addressed)
Co-Authored-By: Claude Fable 5.1 <noreply@anthropic.com>
Claude-Session: https://claude.ai/code/session_01PbSZiMB1koFR46V5hQyVcy
</commit_message>
<xml_diff>
--- a/wc2024227/drafts/second-amended-9A/2026-09-27_SECOND_AMENDED_9A_draft_v2.docx
+++ b/wc2024227/drafts/second-amended-9A/2026-09-27_SECOND_AMENDED_9A_draft_v2.docx
@@ -2326,6 +2326,98 @@
       </w:r>
       <w:r>
         <w:t xml:space="preserve"> No outline addresses the removal of database access or its restoration; the Contact &amp; Number Changes book; any consultation preceding the change notified on 15 April 2024; the reports of the MASPER Registrar of 3 and 8 May 2024; the emails of the Integrated Respiratory Service of 15 and 20 May 2024; the amendment of the clinic contact-details document; the fatigue enquiry of 8 April 2024 or the interval to 1 May 2024; the email to Human Resources of 10 May 2024; or the absence of fatigue risk management at the Switchboard before 30 June 2024. No medical or expert evidence is notified.</w:t>
+      </w:r>
+    </w:p>
+    <w:p>
+      <w:pPr>
+        <w:keepNext/>
+        <w:spacing w:before="120" w:after="60"/>
+      </w:pPr>
+      <w:r>
+        <w:rPr>
+          <w:rFonts w:ascii="Arial" w:hAnsi="Arial"/>
+          <w:b/>
+          <w:sz w:val="21"/>
+        </w:rPr>
+        <w:t xml:space="preserve">7. The documents at Annexure A, and their status</w:t>
+      </w:r>
+    </w:p>
+    <w:p>
+      <w:pPr>
+        <w:keepLines w:val="0"/>
+      </w:pPr>
+      <w:r>
+        <w:t xml:space="preserve">The 39 documents at Annexure A to the notices to admit served 28 August 2026 are the documents from which the facts in Part B are drawn. On 8 September 2026 the Respondent admitted the authenticity of 25 of them and disputed 14. By email of 23 September 2026 it confirmed four of the 14 "upon further review of the appeal file", stated that it had "requested copies of these documents to be disclosed from MSH" for nine others, and did not mention the fourteenth. The facts recorded in every one of the 14 were admitted on 8 September 2026 to the extent set out in Part B; what remains in dispute is the authenticity of the copies, not their content.</w:t>
+      </w:r>
+    </w:p>
+    <w:p>
+      <w:pPr>
+        <w:keepLines w:val="0"/>
+      </w:pPr>
+      <w:r>
+        <w:rPr>
+          <w:b/>
+        </w:rPr>
+        <w:t xml:space="preserve">7.1 Admitted on 8 September 2026 (25 documents).</w:t>
+      </w:r>
+      <w:r>
+        <w:t xml:space="preserve"> Tab 1A, Ms Stibbard to the Switchboard team, "Hello &amp; Update", 18 July 2023, 12:56 pm. Tab 1B, Ms Taylor to Ms Reese, "Fwd: Communication Book Update", 6 June 2023, 4:05 pm, with her email to Logan Switch of 9:57 am that day. Tab 2, the Appellant's email chain "Increase of hours and Workplace issues" and Ms Reese's replies, 7 to 10 August 2023. Tab 3, Ms Reese's email attaching HR Policy E12 and the emails of 4 and 8 September 2023, 29 August to 8 September 2023. Tab 4, "Request to Increase Working Hours to Full Time Rotational Roster" and the emails of 7 August 2023 at 1:43 pm and 5:11 pm, 7 and 31 August 2023. Tab 7, the "Roster Concerns" chain, 26 April to 8 May 2024. Tab 8, Ms Reese to Mr Pritchard and to LBH_HR, 10 and 20 May 2024. Tab 8A, the cover page of QH-GDL-401-3.3:2021. Tab 8B, the MASPER emails and issue logs, 2 to 9 May 2024. Tab 8C, Ms Stibbard's on-call email, 13 May 2024, 4:29 pm. Tab 9, "Switchboard Manager - On call and Hours.", 17 May 2024, 9:30 am. Tab 9A, the "Office Hours and Departmental Directives" chain, 15 May 2024, 1:15 pm, 6:23 pm and 7:09 pm. Tab 9B, Ms Reese's reply, 21 May 2024, 2:53 pm. Tab 10, "Sick leave 14.05.24", 14 May 2024, 12:08 pm, and its forwarding. Tab 11, the Integrated Respiratory Service emails and the replies, 15 and 20 May 2024. Tab 12, "Corey Shepherd 388372 Pay issues", 3 to 13 May 2024. Tab 13, the same thread, 21 May 2024, 12:33 pm. Tab 14, "Validation of Claims older than 3 months - Please sign", 28 May 2024, 8:36 am. Tab 15, the myHR submissions report, 1 February to 31 May 2024. Tab 16, the Leave Takings Report, 19 March 2024. Tab 25, Review Decision 69983, 24 October 2024. Tab 26, the Appellant's first notice to admit facts. Tab 27, the Respondent's response of 18 February 2026. Tab 28, the myHR leave request history for 15480560, 20 February to 1 March 2024. Tab 29, the Instrument of Human Resource Sub-Delegation, effective 5 December 2022.</w:t>
+      </w:r>
+    </w:p>
+    <w:p>
+      <w:pPr>
+        <w:keepLines w:val="0"/>
+      </w:pPr>
+      <w:r>
+        <w:rPr>
+          <w:b/>
+        </w:rPr>
+        <w:t xml:space="preserve">7.2 Disputed on 8 September 2026, confirmed by the Respondent on 23 September 2026 (4 documents).</w:t>
+      </w:r>
+      <w:r>
+        <w:t xml:space="preserve"> Tab 6, Ms Taylor to Logan Switch and the Switchboard staff, "Afterhours Oncall Process - Switchboard", 15 April 2024, 12:39 pm (Stressor 1(e)). Tab 20, the letter of Metro South Hospital and Health Service to Commissioner Dwyer, reference K-LM26/729, 5 June 2026 (Stressors 1(p) and 3(l)). Tab 30, Ms Taylor to Logan Switch and the Switchboard staff, "What's Chloe's Hours?!", 23 August 2023, 2:18 pm (Stressor 1(i)). Tab 30A, Ms Taylor to Logan Switch, "Good morning Team.", 18 June 2024, 8:58 am (Stressor 1(i)). Each was confirmed from the Respondent's own appeal file.</w:t>
+      </w:r>
+    </w:p>
+    <w:p>
+      <w:pPr>
+        <w:keepLines w:val="0"/>
+      </w:pPr>
+      <w:r>
+        <w:rPr>
+          <w:b/>
+        </w:rPr>
+        <w:t xml:space="preserve">7.3 Disputed on 8 September 2026 and referred by the Respondent to Metro South Health on 23 September 2026 (9 documents).</w:t>
+      </w:r>
+      <w:r>
+        <w:t xml:space="preserve"> Tab 1, the role description, Administration Officer, Switchboard Services (AO3), Logan Hospital, undated; its terms are admitted at facts 1 to 13. Tab 5, Ms Taylor to the Appellant, "Approved - Permanent Full Time FTE", 27 September 2023, 1:52 pm; its terms are admitted at facts 37 to 38. Tabs 17, 18 and 19, the movement forms approved by Mr Hughes as delegate, 27 February, 17 April and 9 June 2026, each recording "Continuous Shift Worker"; admitted at facts 14 to 15. Tab 21, Ms Forrest, Senior Consultant, Human Resources, to the Appellant, 7 July 2026, stating that the 8-hour agreement "is only applied where staff initiated shift swaps have occurred"; admitted at facts 224 to 225. Tab 22, the Consultation Paper, Proposed Rosters for Switchboard Services, Logan Hospital, November 2024, signed by Mr Hughes on 12 November 2024; admitted at facts 169 to 175. Tab 23, the Consultation outcome, December 2024, signed by Mr Hughes on 12 December 2024; admitted at facts 167 to 168 and 176 to 177. Tab 31, the screen capture of the workbook "2024 Emergency Code Register.xlsx", March 2024 sheet, entries 16 to 20 March 2024 (Stressor 3(h)); facts 228 to 231 were not admitted. Each of these nine is a Metro South Health document, and five of them (Tabs 17 to 19, 22 and 23) bear the signature of its Director, Corporate Services. The Respondent's email of 23 September 2026 gives no date by which the copies are expected.</w:t>
+      </w:r>
+    </w:p>
+    <w:p>
+      <w:pPr>
+        <w:keepLines w:val="0"/>
+      </w:pPr>
+      <w:r>
+        <w:rPr>
+          <w:b/>
+        </w:rPr>
+        <w:t xml:space="preserve">7.4 Disputed on 8 September 2026 and not addressed on 23 September 2026 (1 document).</w:t>
+      </w:r>
+      <w:r>
+        <w:t xml:space="preserve"> Tab 24, Mr Moran, Organiser, Together Queensland, to Ms Jeffrey, Ms Conaghan and the Appellant, "Switchboard Roster Feedback - For Delegates", 3 November 2025; its terms are admitted at facts 178 to 179. It is not a Metro South Health document, and the Respondent's email of 23 September 2026 does not refer to it.</w:t>
+      </w:r>
+    </w:p>
+    <w:p>
+      <w:pPr>
+        <w:keepLines w:val="0"/>
+      </w:pPr>
+      <w:r>
+        <w:rPr>
+          <w:b/>
+        </w:rPr>
+        <w:t xml:space="preserve">7.5 Documents not at Annexure A that the Respondent's own List of Documents or letter identifies.</w:t>
+      </w:r>
+      <w:r>
+        <w:t xml:space="preserve"> The spreadsheet of recorded MET calls for 17 and 18 March 2024, which Metro South Health states is available [¶ 268]. The Logan Hospital emergency code procedures referred to in the role description [¶ 8]. The documents recording the advice of Human Resources on the 8-hour agreement, to which the Respondent's outlines of Ms Taylor and Ms Reese refer (Part B.6) and which neither identifies. The Communication Book, which the Respondent's List of Documents does not list; paragraph 154 of the notice was not admitted.</w:t>
       </w:r>
     </w:p>
     <w:p>

</xml_diff>

<commit_message>
WC/2024/227: stand-alone check closed (2(h), 3(n), 1(k), C.9); long-form explanation by stressor with every crossover fact
Co-Authored-By: Claude Fable 5.1 <noreply@anthropic.com>
Claude-Session: https://claude.ai/code/session_01PbSZiMB1koFR46V5hQyVcy
</commit_message>
<xml_diff>
--- a/wc2024227/drafts/second-amended-9A/2026-09-27_SECOND_AMENDED_9A_draft_v2.docx
+++ b/wc2024227/drafts/second-amended-9A/2026-09-27_SECOND_AMENDED_9A_draft_v2.docx
@@ -871,7 +871,7 @@
         <w:t>(k) The matters raised in August and September 2023, and the response.</w:t>
       </w:r>
       <w:r>
-        <w:t xml:space="preserve"> On 7 August 2023 at 12:21 pm the Appellant wrote: "Please give me some space and stop with any further communication as I have had enough of it." [¶ 155]</w:t>
+        <w:t xml:space="preserve"> On 7 August 2023 at 12:21 pm the Appellant wrote to the Manager, the Director, Ms Conaghan and Ms Smith, marked of High importance, asking to "formally adhoc an additional 2 shifts per fortnight" under clause 11.7 of the agreement, and: "Please give me some space and stop with any further communication as I have had enough of it." [¶¶ 26 to 27, 155]</w:t>
       </w:r>
     </w:p>
     <w:p>
@@ -1115,7 +1115,7 @@
         <w:t>(q) Matters pleaded as context only.</w:t>
       </w:r>
       <w:r>
-        <w:t xml:space="preserve"> The Respondent does not allege that the Appellant was subject to any disciplinary process, or that his work performance was the subject of any formal performance management process, before 18 June 2024, nor does it describe any communication with him before that date as a warning. [¶¶ 300 to 302] The matters at (j), (k), (l), (m), (n) and (o) above, and at paragraph 3 below, are pleaded as part of the sequence of matters the Appellant raised and the responses he received. They are not relied upon as independent causative circumstances within Stressor 1. Where an admitted fact from that sequence is separately repeated under Stressor 2 or Stressor 3, it is relied upon there only for the distinct function stated under that stressor. The causative circumstances relied upon in Stressor 1 are those at (a) to (i) and (p).</w:t>
+        <w:t xml:space="preserve"> The Respondent does not allege that the Appellant was subject to any disciplinary process, or that his work performance was the subject of any formal performance management process, before 18 June 2024, nor does it describe any communication with him before that date as a warning. [¶¶ 300 to 302] Paragraph 27 of its amended statement of facts and contentions does not identify the management action relied upon. [¶ 303] The matters at (j), (k), (l), (m), (n) and (o) above, and at paragraph 3 below, are pleaded as part of the sequence of matters the Appellant raised and the responses he received. They are not relied upon as independent causative circumstances within Stressor 1. Where an admitted fact from that sequence is separately repeated under Stressor 2 or Stressor 3, it is relied upon there only for the distinct function stated under that stressor. The causative circumstances relied upon in Stressor 1 are those at (a) to (i) and (p).</w:t>
       </w:r>
     </w:p>
     <w:p>
@@ -1328,6 +1328,20 @@
     </w:p>
     <w:p>
       <w:pPr>
+        <w:keepLines w:val="0"/>
+      </w:pPr>
+      <w:r>
+        <w:rPr>
+          <w:b/>
+        </w:rPr>
+        <w:t xml:space="preserve">(h) The Respondent's pleaded answer to this stressor.</w:t>
+      </w:r>
+      <w:r>
+        <w:t xml:space="preserve"> The Respondent does not allege that the Appellant was subject to any disciplinary process, or that his work performance was the subject of any formal performance management process, before 18 June 2024, nor does it describe any communication with him before that date as a warning. [¶¶ 300 to 302] Paragraph 27 of its amended statement of facts and contentions, which contends that any management action was reasonable management action taken in a reasonable way, does not identify, by particular, date, document or cross-reference, the management action relied upon. [¶¶ 238, 303]</w:t>
+      </w:r>
+    </w:p>
+    <w:p>
+      <w:pPr>
         <w:pStyle w:val="Callout"/>
         <w:shd w:fill="F2F2F2"/>
       </w:pPr>
@@ -1920,6 +1934,20 @@
     </w:p>
     <w:p>
       <w:pPr>
+        <w:keepLines w:val="0"/>
+      </w:pPr>
+      <w:r>
+        <w:rPr>
+          <w:b/>
+        </w:rPr>
+        <w:t xml:space="preserve">(n) The Respondent's pleaded answer to this stressor.</w:t>
+      </w:r>
+      <w:r>
+        <w:t xml:space="preserve"> Beyond the matters at (g) and (i) above, the Respondent does not allege that the Appellant was subject to any disciplinary process, or that his work performance was the subject of any formal performance management process, before 18 June 2024, nor does it describe any communication with him before that date as a warning. [¶¶ 300 to 302] Paragraph 27 of its amended statement of facts and contentions does not identify, by particular, date, document or cross-reference, the management action relied upon. [¶¶ 238, 303] The employer's own account of its complaint handling is that complaints "are made directly to the Line Manager of Switch Board and managed solely via email or verbally with the complainant", and no change to operating procedures as a consequence of any employee complaint is alleged. [¶¶ 267, 272]</w:t>
+      </w:r>
+    </w:p>
+    <w:p>
+      <w:pPr>
         <w:pStyle w:val="Callout"/>
         <w:shd w:fill="F2F2F2"/>
       </w:pPr>
@@ -2575,7 +2603,7 @@
         <w:t>9.</w:t>
       </w:r>
       <w:r>
-        <w:t xml:space="preserve"> The hearing de novo. The Respondent says no finding in Review Decision 69983 binds the Commission. That is accepted, and it applies to the whole of the decision. The conclusion under appeal is a conclusion of that decision, reached upon the findings recorded in it.</w:t>
+        <w:t xml:space="preserve"> The hearing de novo. The Respondent admits the contents of Review Decision 69983 and says no finding in it binds the Commission because the hearing is de novo. [¶ 295] That is accepted, and it applies to the whole of the decision. The conclusion under appeal is a conclusion of that decision, reached upon the findings recorded in it.</w:t>
       </w:r>
     </w:p>
     <w:p>

</xml_diff>

<commit_message>
WC/2024/227: 9A v2 — Stressor 2(e)(i): when the pay corrections reached a payslip (5 Jun 2024 after last shift; 9 Feb 2024 shift corrected 30 Jun 2025), from Payroll's own disclosed email and payslips
Co-Authored-By: Claude Fable 5.1 <noreply@anthropic.com>
Claude-Session: https://claude.ai/code/session_01PbSZiMB1koFR46V5hQyVcy
</commit_message>
<xml_diff>
--- a/wc2024227/drafts/second-amended-9A/2026-09-27_SECOND_AMENDED_9A_draft_v2.docx
+++ b/wc2024227/drafts/second-amended-9A/2026-09-27_SECOND_AMENDED_9A_draft_v2.docx
@@ -1306,6 +1306,44 @@
         <w:rPr>
           <w:b/>
         </w:rPr>
+        <w:t xml:space="preserve">(e)(i) When the corrections reached a payslip, and where the Appellant was.</w:t>
+      </w:r>
+      <w:r>
+        <w:t xml:space="preserve"> The Manager's email of 21 May 2024 stated: "I will let you know PRN once it has been submitted." [¶ 195] The AVAC was submitted on 28 May 2024 and processed on 30 May 2024 as "Part Completed". [¶ 203] The Appellant will give evidence that he was not told that it had been submitted, or its process reference. His last day of attendance for a rostered shift was 3 June 2024; he was on leave from 7 to 12 June 2024; the date of injury certified by his general practitioner is 18 June 2024 (Part B.1.4 to 1.5).</w:t>
+      </w:r>
+    </w:p>
+    <w:p>
+      <w:pPr>
+        <w:keepLines w:val="0"/>
+      </w:pPr>
+      <w:r>
+        <w:t xml:space="preserve">Payroll's own account of when each correction was made is in its email to the Respondent of 11 July 2025 and the payslips attached to it, disclosed by the Respondent in July 2025 (Disclosure from witness conferencing, Queensland Health Payroll, pp 2 to 3 and 19 to 24). It states: for the fortnight commencing 19 February 2024, "Payslip 06 attached, page 3 shows the 'Hours_Top-Up - Adjustment' of $39.81 being reversed and replaced with 'NP_Special_Leave - Adjustment' which is leave without pay for the hour on the 28/02/2024 shift"; for the fortnight commencing 18 March 2024, "Payslip 06 attached, page 3 shows the 30.03.2024 being amended to 'PubHolLv-DayPayforOffDay' (public holiday allowance)"; for the fortnight commencing 1 April 2024, "Payslip 06 attached, page 3 shows 'Overtime_-_4.0' amended for the shift on the 01.04.2024"; and for the fortnight commencing 5 February 2024, "The shift on the 09.02.2024 was amended with an exemption for the Validation of Claims form on the 30.06.2025 and is on Payslip 07."</w:t>
+      </w:r>
+    </w:p>
+    <w:p>
+      <w:pPr>
+        <w:keepLines w:val="0"/>
+      </w:pPr>
+      <w:r>
+        <w:t xml:space="preserve">Payslip 06 is for the pay period 13 to 26 May 2024 and bears the pay date 5 June 2024. Its adjustments page records: PubHolLv-DayPayforOffDay 30.03.2024, 7.60 units, $318.51; Overtime 01.04.2024, 1.00 unit, $167.64; Public_Holiday_150% 01.04.2024, -1.00 unit, -$62.86; Hours_Reduction 14.04.2024, 0.95 units, $39.81; Hours_Top-Up - Adjustment, -$39.81; total adjustments from previous pay periods $390.23. That pay date was two days after the Appellant's last shift, while he was on leave, and thirteen days before the certified date of injury. Three of the four fortnights identified by Payroll on 3 May 2024 were therefore adjusted on a payslip issued after he had stopped work, 33 days after Payroll's direction; and the adjustment for the fortnight commencing 19 February 2024 was made by reversing the top-up and recording the hour as leave without pay.</w:t>
+      </w:r>
+    </w:p>
+    <w:p>
+      <w:pPr>
+        <w:keepLines w:val="0"/>
+      </w:pPr>
+      <w:r>
+        <w:t xml:space="preserve">Payslip 07 is for the pay period 9 to 22 June 2025 and bears the pay date 2 July 2025. Its adjustments page records, against the 5 February 2024 fortnight: Public_Holiday_Not_Requir - Adjustment, -$318.51; Hours_Reduction - Adjustment, $316.41; Hours_Top-Up - Adjustment, $2.10; total adjustments $0.00. On Payroll's own account, the correction of the 9 February 2024 shift was made on 30 June 2025, 423 days after Payroll's direction of 3 May 2024, after the date of injury, after the Respondent's review decision of 24 October 2024, and after this appeal was commenced; and it was made with "an exemption for the Validation of Claims form" that the Manager had asked the Appellant to sign on 28 May 2024. [¶¶ 196 to 197] The Respondent's List of Documents and its outlines of evidence (Part B.6) describe the pay issues as "corrected" and "remedied in a timely manner" [¶ 207] without stating these dates.</w:t>
+      </w:r>
+    </w:p>
+    <w:p>
+      <w:pPr>
+        <w:keepLines w:val="0"/>
+      </w:pPr>
+      <w:r>
+        <w:rPr>
+          <w:b/>
+        </w:rPr>
         <w:t>(f) Paid Special Pandemic Leave - the same admitted sequence relied upon as an employment entitlement.</w:t>
       </w:r>
       <w:r>
@@ -2128,6 +2166,20 @@
     </w:p>
     <w:p>
       <w:pPr>
+        <w:keepLines w:val="0"/>
+      </w:pPr>
+      <w:r>
+        <w:rPr>
+          <w:b/>
+        </w:rPr>
+        <w:t xml:space="preserve">4.6 Between Payroll's direction of 3 May 2024 and the pay date of the payslip carrying three of the four corrections, 5 June 2024: 33 days.</w:t>
+      </w:r>
+      <w:r>
+        <w:t xml:space="preserve"> Between that direction and the pay date of the payslip carrying the fourth, 2 July 2025: 425 days, the amendment itself being dated 30 June 2025. Between the Appellant's last shift, 3 June 2024, and the first of those pay dates: two days.</w:t>
+      </w:r>
+    </w:p>
+    <w:p>
+      <w:pPr>
         <w:spacing w:after="60"/>
         <w:ind w:left="142"/>
       </w:pPr>
@@ -2445,7 +2497,7 @@
         <w:t xml:space="preserve">7.5 Documents not at Annexure A that the Respondent's own List of Documents or letter identifies.</w:t>
       </w:r>
       <w:r>
-        <w:t xml:space="preserve"> The spreadsheet of recorded MET calls for 17 and 18 March 2024, which Metro South Health states is available [¶ 268]. The Logan Hospital emergency code procedures referred to in the role description [¶ 8]. The documents recording the advice of Human Resources on the 8-hour agreement, to which the Respondent's outlines of Ms Taylor and Ms Reese refer (Part B.6) and which neither identifies. The Communication Book, which the Respondent's List of Documents does not list; paragraph 154 of the notice was not admitted.</w:t>
+        <w:t xml:space="preserve"> The spreadsheet of recorded MET calls for 17 and 18 March 2024, which Metro South Health states is available [¶ 268]. The Logan Hospital emergency code procedures referred to in the role description [¶ 8]. The documents recording the advice of Human Resources on the 8-hour agreement, to which the Respondent's outlines of Ms Taylor and Ms Reese refer (Part B.6) and which neither identifies. The Communication Book, which the Respondent's List of Documents does not list; paragraph 154 of the notice was not admitted. The Respondent's disclosure of July 2025 headed "Disclosure from witness conferencing - Qld Health Payroll" (24 pages): the email of Ms Christensen, Manager Service Delivery, Payroll, to the Respondent of 11 July 2025, and Payslips 01 to 07, including Payslip 06 (pay date 5 June 2024) and Payslip 07 (pay date 2 July 2025), relied upon at Stressor 2(e)(i).</w:t>
       </w:r>
     </w:p>
     <w:p>

</xml_diff>

<commit_message>
WC/2024/227: 9A v2 — 2(e)(i) shift-by-shift with the days raised, no amounts; pandemic leave: sent to the Manager as asked, then redirected to myHR
Co-Authored-By: Claude Fable 5.1 <noreply@anthropic.com>
Claude-Session: https://claude.ai/code/session_01PbSZiMB1koFR46V5hQyVcy
</commit_message>
<xml_diff>
--- a/wc2024227/drafts/second-amended-9A/2026-09-27_SECOND_AMENDED_9A_draft_v2.docx
+++ b/wc2024227/drafts/second-amended-9A/2026-09-27_SECOND_AMENDED_9A_draft_v2.docx
@@ -946,26 +946,10 @@
         <w:rPr>
           <w:b/>
         </w:rPr>
-        <w:t>(l) The special pandemic leave application, February 2024 - the sequence.</w:t>
-      </w:r>
-      <w:r>
-        <w:t xml:space="preserve"> The review decision records that on 20 February 2024 the Appellant messaged the Switchboard Manager stating he had tested positive for COVID-19, and that she "requested that you send it to her so she could submit it in MyHR". [¶ 136]</w:t>
-      </w:r>
-    </w:p>
-    <w:p>
-      <w:pPr>
-        <w:keepLines w:val="0"/>
-      </w:pPr>
-      <w:r>
-        <w:t>The Respondent pleads that she asked him to submit a Special Pandemic Leave request via myHR himself and attach a statutory declaration or photo evidence of his test. [¶ 132] The myHR submissions report records the initiator of that Smart Leave Request as the Appellant. [¶¶ 140 to 141]</w:t>
-      </w:r>
-    </w:p>
-    <w:p>
-      <w:pPr>
-        <w:keepLines w:val="0"/>
-      </w:pPr>
-      <w:r>
-        <w:t>The Respondent does not allege that any other Switchboard employee was required to submit such a request personally through myHR in February 2024. [¶ 142] The leave request history for Process Reference 15480560 records the Appellant creating a draft at 11:24:48 on 20 February 2024 and submitting the request at 11:41:27 that morning. [¶¶ 114 to 115]</w:t>
+        <w:t xml:space="preserve">(l) The special pandemic leave application, February 2024 - the sequence.</w:t>
+      </w:r>
+      <w:r>
+        <w:t xml:space="preserve"> On 20 February 2024 the Appellant messaged the Manager that he had tested positive for COVID-19. She replied that he was eligible for up to five days' paid leave on photo evidence of the test, and "requested that you send it to her so she could submit it in MyHR". [¶ 136] The Appellant will give evidence that he sent it to her as she asked. She then asked him to submit the Special Pandemic Leave request through myHR himself and attach a statutory declaration or photo evidence of his test. [¶ 132] The myHR submissions report records the initiator of that request as the Appellant [¶¶ 140 to 141], and the Respondent does not allege that any other Switchboard employee was required to submit such a request personally through myHR in February 2024. [¶ 142] The leave request history for Process Reference 15480560 records him creating a draft at 11:24:48 that morning and submitting the request at 11:41:27. [¶¶ 114 to 115] So the material was provided to the Manager once, as requested, and then had to be submitted by him through the system: once that morning, and, after two declines, twice more.</w:t>
       </w:r>
     </w:p>
     <w:p>
@@ -1306,10 +1290,10 @@
         <w:rPr>
           <w:b/>
         </w:rPr>
-        <w:t xml:space="preserve">(e)(i) When the corrections reached a payslip, and where the Appellant was.</w:t>
-      </w:r>
-      <w:r>
-        <w:t xml:space="preserve"> The Manager's email of 21 May 2024 stated: "I will let you know PRN once it has been submitted." [¶ 195] The AVAC was submitted on 28 May 2024 and processed on 30 May 2024 as "Part Completed". [¶ 203] The Appellant will give evidence that he was not told that it had been submitted, or its process reference. His last day of attendance for a rostered shift was 3 June 2024; he was on leave from 7 to 12 June 2024; the date of injury certified by his general practitioner is 18 June 2024 (Part B.1.4 to 1.5).</w:t>
+        <w:t xml:space="preserve">(e)(i) Each incorrect shift, when it was raised, and when it was corrected.</w:t>
+      </w:r>
+      <w:r>
+        <w:t xml:space="preserve"> The shift of 9 February 2024 was recorded as seven hours instead of eight, so the fortnight commencing 5 February 2024 was under the contracted hours and was topped up from the Appellant's RDO balance. [¶¶ 185 to 186] The shift of 28 February 2024 was recorded the same way, with the same result for the fortnight commencing 19 February 2024. [¶ 187] The fortnight commencing 18 March 2024, which contained the shifts of 17 and 18 March, was recorded with too many ordinary shifts, reducing wages, because one of the shifts needed to be overtime. [¶ 188] The fortnight commencing 1 April 2024 was over the contracted 76 hours, again requiring overtime. [¶ 189] The public holiday of 30 March 2024 was, on Payroll's later account, "submitted late".</w:t>
       </w:r>
     </w:p>
     <w:p>
@@ -1317,7 +1301,7 @@
         <w:keepLines w:val="0"/>
       </w:pPr>
       <w:r>
-        <w:t xml:space="preserve">Payroll's own account of when each correction was made is in its email to the Respondent of 11 July 2025 and the payslips attached to it, disclosed by the Respondent in July 2025 (Disclosure from witness conferencing, Queensland Health Payroll, pp 2 to 3 and 19 to 24). It states: for the fortnight commencing 19 February 2024, "Payslip 06 attached, page 3 shows the 'Hours_Top-Up - Adjustment' of $39.81 being reversed and replaced with 'NP_Special_Leave - Adjustment' which is leave without pay for the hour on the 28/02/2024 shift"; for the fortnight commencing 18 March 2024, "Payslip 06 attached, page 3 shows the 30.03.2024 being amended to 'PubHolLv-DayPayforOffDay' (public holiday allowance)"; for the fortnight commencing 1 April 2024, "Payslip 06 attached, page 3 shows 'Overtime_-_4.0' amended for the shift on the 01.04.2024"; and for the fortnight commencing 5 February 2024, "The shift on the 09.02.2024 was amended with an exemption for the Validation of Claims form on the 30.06.2025 and is on Payslip 07."</w:t>
+        <w:t xml:space="preserve">The Appellant raised the pay for the period 8 to 31 March 2024 with the Manager on 8 April 2024. [¶ 242] On 9 April she replied that she had escalated the fatigue enquiry to Human Resources. [¶ 244] On 24 April he wrote that it had been more than two weeks without any response or overtime payment. [¶ 246] On 1 May she replied that the fatigue payment for 18 March would not be processed, and that payroll was still reviewing his public holiday entitlements. [¶¶ 247, 255] On 3 May Payroll identified all four fortnights and directed the Manager to submit an AVAC for each. [¶¶ 185 to 190] On 10 May the Appellant wrote to Payroll and the Manager. [¶ 191] On 13 May Payroll replied that none of the issues had been corrected and that the Line Manager had to submit the AVAC. [¶¶ 192 to 193] On 21 May the Manager wrote that she was still waiting for payroll confirmation and: "I will let you know PRN once it has been submitted." [¶ 195] On 28 May she sent the Validation of Claims form for signature and submitted the AVAC; it was processed on 30 May as "Part Completed". [¶¶ 196 to 197, 203, 209] The Appellant will give evidence that he was not told that it had been submitted, or its process reference. His last day of attendance for a rostered shift was 3 June 2024; he was on leave from 7 to 12 June 2024; the date of injury certified by his general practitioner is 18 June 2024 (Part B.1.4 to 1.5).</w:t>
       </w:r>
     </w:p>
     <w:p>
@@ -1325,7 +1309,7 @@
         <w:keepLines w:val="0"/>
       </w:pPr>
       <w:r>
-        <w:t xml:space="preserve">Payslip 06 is for the pay period 13 to 26 May 2024 and bears the pay date 5 June 2024. Its adjustments page records: PubHolLv-DayPayforOffDay 30.03.2024, 7.60 units, $318.51; Overtime 01.04.2024, 1.00 unit, $167.64; Public_Holiday_150% 01.04.2024, -1.00 unit, -$62.86; Hours_Reduction 14.04.2024, 0.95 units, $39.81; Hours_Top-Up - Adjustment, -$39.81; total adjustments from previous pay periods $390.23. That pay date was two days after the Appellant's last shift, while he was on leave, and thirteen days before the certified date of injury. Three of the four fortnights identified by Payroll on 3 May 2024 were therefore adjusted on a payslip issued after he had stopped work, 33 days after Payroll's direction; and the adjustment for the fortnight commencing 19 February 2024 was made by reversing the top-up and recording the hour as leave without pay.</w:t>
+        <w:t xml:space="preserve">When each correction was made is stated by Payroll itself, in its email to the Respondent of 11 July 2025 and the payslips attached to it, disclosed by the Respondent in July 2025 (Disclosure from witness conferencing, Queensland Health Payroll, pp 2 to 3 and 19 to 24). The shifts of 28 February, 30 March and 1 April 2024 were adjusted on Payslip 06, for the pay period 13 to 26 May 2024, pay date 5 June 2024: two days after the Appellant's last shift, while he was on leave, thirteen days before the certified date of injury, and 33 days after Payroll's direction. On Payroll's account the 28 February adjustment was made by reversing the hours top-up and replacing it with an adjustment "which is leave without pay for the hour on the 28/02/2024 shift"; the 30 March entry was "amended to 'PubHolLv-DayPayforOffDay' (public holiday allowance)"; and the 1 April shift was amended to overtime.</w:t>
       </w:r>
     </w:p>
     <w:p>
@@ -1333,7 +1317,7 @@
         <w:keepLines w:val="0"/>
       </w:pPr>
       <w:r>
-        <w:t xml:space="preserve">Payslip 07 is for the pay period 9 to 22 June 2025 and bears the pay date 2 July 2025. Its adjustments page records, against the 5 February 2024 fortnight: Public_Holiday_Not_Requir - Adjustment, -$318.51; Hours_Reduction - Adjustment, $316.41; Hours_Top-Up - Adjustment, $2.10; total adjustments $0.00. On Payroll's own account, the correction of the 9 February 2024 shift was made on 30 June 2025, 423 days after Payroll's direction of 3 May 2024, after the date of injury, after the Respondent's review decision of 24 October 2024, and after this appeal was commenced; and it was made with "an exemption for the Validation of Claims form" that the Manager had asked the Appellant to sign on 28 May 2024. [¶¶ 196 to 197] The Respondent's List of Documents and its outlines of evidence (Part B.6) describe the pay issues as "corrected" and "remedied in a timely manner" [¶ 207] without stating these dates.</w:t>
+        <w:t xml:space="preserve">The shift of 9 February 2024 was not corrected on that payslip. On Payroll's account it "was amended with an exemption for the Validation of Claims form on the 30.06.2025 and is on Payslip 07", for the pay period 9 to 22 June 2025, pay date 2 July 2025: after the date of injury, after the Respondent's review decision of 24 October 2024, and after this appeal was commenced, with an exemption from the form the Manager had asked the Appellant to sign on 28 May 2024. [¶¶ 196 to 197] The Respondent's pleading and its outlines of evidence (Part B.6) describe the pay issues as "corrected" and "remedied in a timely manner" [¶ 207] without stating these dates.</w:t>
       </w:r>
     </w:p>
     <w:p>
@@ -1347,7 +1331,7 @@
         <w:t>(f) Paid Special Pandemic Leave - the same admitted sequence relied upon as an employment entitlement.</w:t>
       </w:r>
       <w:r>
-        <w:t xml:space="preserve"> The power to approve or not approve paid Special Pandemic Leave for the COVID-19 event was sub-delegated by the Health Service Chief Executive to a Band 9 delegate, and the Instrument states that the power could not be further sub-delegated. [¶¶ 127 to 128] On 20 February 2024 the review decision records the Manager asking the Appellant to send his material to her so she could submit it in myHR; the leave history records the Appellant creating the draft and submitting the request that morning. [¶¶ 114 to 115, 136] The history records the request being declined on 21 February, resubmitted on 28 February, declined again on 29 February, submitted a third time at 11:07:28 that day and approved at 11:21:03. [¶¶ 116 to 120] It records the Appellant as making three submissions, the Manager as declining twice, the Manager as "Reviewer" and the Director as "Manager", with the Director recording final approval on 1 March 2024. [¶¶ 121 to 123, 126] The review decision records that on the first decline the stated reason was the minimum period for COVID leave while the statutory declaration was said to be sufficient; it records the Appellant saying he was confused by the second decline and had done everything required. [¶¶ 137 to 139] The Respondent's pleading states that the later decline was because the statutory declaration was assessed as not attached, but that review showed the attachments were in fact present, and pleads human error against a background of high work demands. [¶¶ 133 to 135] The Respondent does not allege that either recorded approver was a Band 9 delegate at the relevant time and does not identify the person who exercised the sub-delegated power for Process Reference 15480560; nor does it allege that any other Switchboard employee was required personally to submit such a request through myHR in February 2024. [¶¶ 129 to 131, 142] This sequence is deliberately repeated from Stressor 1(l)-(m): in Stressor 2 it is relied upon as the handling of a paid employment entitlement that required repeated submissions and a decision process the Appellant could not complete by himself, not as a separate injury.</w:t>
+        <w:t xml:space="preserve"> The power to approve or not approve paid Special Pandemic Leave for the COVID-19 event was sub-delegated by the Health Service Chief Executive to a Band 9 delegate, and the Instrument states that the power could not be further sub-delegated. [¶¶ 127 to 128] On 20 February 2024 the Manager asked the Appellant to send his material to her so she could submit it in myHR [¶ 136]; he did so; she then asked him to submit it through myHR himself [¶ 132], and the leave history records him creating the draft and submitting the request that morning. [¶¶ 114 to 115] The history records the request being declined on 21 February, resubmitted on 28 February, declined again on 29 February, submitted a third time at 11:07:28 that day and approved at 11:21:03. [¶¶ 116 to 120] It records the Appellant as making three submissions, the Manager as declining twice, the Manager as "Reviewer" and the Director as "Manager", with the Director recording final approval on 1 March 2024. [¶¶ 121 to 123, 126] The review decision records that on the first decline the stated reason was the minimum period for COVID leave while the statutory declaration was said to be sufficient; it records the Appellant saying he was confused by the second decline and had done everything required. [¶¶ 137 to 139] The Respondent's pleading states that the later decline was because the statutory declaration was assessed as not attached, but that review showed the attachments were in fact present, and pleads human error against a background of high work demands. [¶¶ 133 to 135] The Respondent does not allege that either recorded approver was a Band 9 delegate at the relevant time and does not identify the person who exercised the sub-delegated power for Process Reference 15480560; nor does it allege that any other Switchboard employee was required personally to submit such a request through myHR in February 2024. [¶¶ 129 to 131, 142] This sequence is deliberately repeated from Stressor 1(l)-(m): in Stressor 2 it is relied upon as the handling of a paid employment entitlement that required repeated submissions and a decision process the Appellant could not complete by himself, not as a separate injury.</w:t>
       </w:r>
     </w:p>
     <w:p>

</xml_diff>

<commit_message>
WC/2024/227: 9A v2 — non-admitted matters stated in the same voice as the rest; 'will give evidence' phrasing removed from the narrative
Co-Authored-By: Claude Fable 5.1 <noreply@anthropic.com>
Claude-Session: https://claude.ai/code/session_01PbSZiMB1koFR46V5hQyVcy
</commit_message>
<xml_diff>
--- a/wc2024227/drafts/second-amended-9A/2026-09-27_SECOND_AMENDED_9A_draft_v2.docx
+++ b/wc2024227/drafts/second-amended-9A/2026-09-27_SECOND_AMENDED_9A_draft_v2.docx
@@ -463,7 +463,7 @@
         <w:keepLines w:val="0"/>
       </w:pPr>
       <w:r>
-        <w:t>The Appellant pleads no characterisation of any person. The availability of those two persons is pleaded because it determined how long an incorrect entry remained uncorrected.</w:t>
+        <w:t>The availability of those two persons determined how long an incorrect entry remained uncorrected.</w:t>
       </w:r>
     </w:p>
     <w:p>
@@ -599,7 +599,7 @@
         <w:keepLines w:val="0"/>
       </w:pPr>
       <w:r>
-        <w:t xml:space="preserve">The Appellant will give evidence that the console took in the order of 270 to 440 calls on an eight-hour shift, and that emergency codes were received and paged through it throughout the day (Stressor 3(h) below). That evidence is his own and is not admitted.</w:t>
+        <w:t xml:space="preserve">The console took in the order of 270 to 440 calls on an eight-hour shift, and emergency codes were received and paged through it throughout the day (Stressor 3(h) below).</w:t>
       </w:r>
     </w:p>
     <w:p>
@@ -949,7 +949,7 @@
         <w:t xml:space="preserve">(l) The special pandemic leave application, February 2024 - the sequence.</w:t>
       </w:r>
       <w:r>
-        <w:t xml:space="preserve"> On 20 February 2024 the Appellant messaged the Manager that he had tested positive for COVID-19. She replied that he was eligible for up to five days' paid leave on photo evidence of the test, and "requested that you send it to her so she could submit it in MyHR". [¶ 136] The Appellant will give evidence that he sent it to her as she asked. She then asked him to submit the Special Pandemic Leave request through myHR himself and attach a statutory declaration or photo evidence of his test. [¶ 132] The myHR submissions report records the initiator of that request as the Appellant [¶¶ 140 to 141], and the Respondent does not allege that any other Switchboard employee was required to submit such a request personally through myHR in February 2024. [¶ 142] The leave request history for Process Reference 15480560 records him creating a draft at 11:24:48 that morning and submitting the request at 11:41:27. [¶¶ 114 to 115] So the material was provided to the Manager once, as requested, and then had to be submitted by him through the system: once that morning, and, after two declines, twice more.</w:t>
+        <w:t xml:space="preserve"> On 20 February 2024 the Appellant messaged the Manager that he had tested positive for COVID-19. She replied that he was eligible for up to five days' paid leave on photo evidence of the test, and "requested that you send it to her so she could submit it in MyHR". [¶ 136] He sent it to her as she asked. She then asked him to submit the Special Pandemic Leave request through myHR himself and attach a statutory declaration or photo evidence of his test. [¶ 132] The myHR submissions report records the initiator of that request as the Appellant [¶¶ 140 to 141], and the Respondent does not allege that any other Switchboard employee was required to submit such a request personally through myHR in February 2024. [¶ 142] The leave request history for Process Reference 15480560 records him creating a draft at 11:24:48 that morning and submitting the request at 11:41:27. [¶¶ 114 to 115] So the material was provided to the Manager once, as requested, and then had to be submitted by him through the system: once that morning, and, after two declines, twice more.</w:t>
       </w:r>
     </w:p>
     <w:p>
@@ -1301,7 +1301,7 @@
         <w:keepLines w:val="0"/>
       </w:pPr>
       <w:r>
-        <w:t xml:space="preserve">The Appellant raised the pay for the period 8 to 31 March 2024 with the Manager on 8 April 2024. [¶ 242] On 9 April she replied that she had escalated the fatigue enquiry to Human Resources. [¶ 244] On 24 April he wrote that it had been more than two weeks without any response or overtime payment. [¶ 246] On 1 May she replied that the fatigue payment for 18 March would not be processed, and that payroll was still reviewing his public holiday entitlements. [¶¶ 247, 255] On 3 May Payroll identified all four fortnights and directed the Manager to submit an AVAC for each. [¶¶ 185 to 190] On 10 May the Appellant wrote to Payroll and the Manager. [¶ 191] On 13 May Payroll replied that none of the issues had been corrected and that the Line Manager had to submit the AVAC. [¶¶ 192 to 193] On 21 May the Manager wrote that she was still waiting for payroll confirmation and: "I will let you know PRN once it has been submitted." [¶ 195] On 28 May she sent the Validation of Claims form for signature and submitted the AVAC; it was processed on 30 May as "Part Completed". [¶¶ 196 to 197, 203, 209] The Appellant will give evidence that he was not told that it had been submitted, or its process reference. His last day of attendance for a rostered shift was 3 June 2024; he was on leave from 7 to 12 June 2024; the date of injury certified by his general practitioner is 18 June 2024 (Part B.1.4 to 1.5).</w:t>
+        <w:t xml:space="preserve">The Appellant raised the pay for the period 8 to 31 March 2024 with the Manager on 8 April 2024. [¶ 242] On 9 April she replied that she had escalated the fatigue enquiry to Human Resources. [¶ 244] On 24 April he wrote that it had been more than two weeks without any response or overtime payment. [¶ 246] On 1 May she replied that the fatigue payment for 18 March would not be processed, and that payroll was still reviewing his public holiday entitlements. [¶¶ 247, 255] On 3 May Payroll identified all four fortnights and directed the Manager to submit an AVAC for each. [¶¶ 185 to 190] On 10 May the Appellant wrote to Payroll and the Manager. [¶ 191] On 13 May Payroll replied that none of the issues had been corrected and that the Line Manager had to submit the AVAC. [¶¶ 192 to 193] On 21 May the Manager wrote that she was still waiting for payroll confirmation and: "I will let you know PRN once it has been submitted." [¶ 195] On 28 May she sent the Validation of Claims form for signature and submitted the AVAC; it was processed on 30 May as "Part Completed". [¶¶ 196 to 197, 203, 209] He was not told that it had been submitted, or its process reference. His last day of attendance for a rostered shift was 3 June 2024; he was on leave from 7 to 12 June 2024; the date of injury certified by his general practitioner is 18 June 2024 (Part B.1.4 to 1.5).</w:t>
       </w:r>
     </w:p>
     <w:p>
@@ -1678,7 +1678,7 @@
         <w:rPr>
           <w:b/>
         </w:rPr>
-        <w:t xml:space="preserve">(h)(ii) The codes on the shift of 17 March 2024, as documented by the Appellant.</w:t>
+        <w:t xml:space="preserve">(h)(ii) The codes on the shift of 17 March 2024.</w:t>
       </w:r>
       <w:r>
         <w:t xml:space="preserve"> The shift ended at 23:00. [¶ 284] The Emergency Code Register for that day (Tab 31) records eight codes: at 3:57 a Code Grey in the ED lounge; at 5:19 a MET call to Ward 5A bed 27; at 7:48 a Code Grey in the ED corridor near short stay; at 13:48 a MET call to Ward 3B bed 2; at 14:13 a Code Grey in ED adult acute bed 15; at 19:16 a MET call to Ward 2H bed 7; at 19:20, four minutes later, a Code Blue to the same patient, Ward 2H bed 7; and at 21:16 a MET call to Ward 2Q bed 5. The last three fell in the evening of that shift.</w:t>
@@ -1692,7 +1692,7 @@
         <w:rPr>
           <w:b/>
         </w:rPr>
-        <w:t xml:space="preserve">(h)(iii) The codes on the shift of 18 March 2024, as documented by the Appellant.</w:t>
+        <w:t xml:space="preserve">(h)(iii) The codes on the shift of 18 March 2024.</w:t>
       </w:r>
       <w:r>
         <w:t xml:space="preserve"> The shift began at 06:00, seven hours after the previous one ended. [¶ 284] The register records eleven codes that day: at 8:48 a Code Grey at the QAS triage airlock; at 9:20 a MET call to Ward 6A bed 8; at 11:31 a MET call to Ward 3DR bed 14, cancelled at 11:32; at 11:35 a Neonatal MET call to Theatre 2; at 13:09 a Neonatal MET call to Birth Suite 5; at 14:38 a MET call to Ward 3DR bed 11; at 14:45 and 14:55 Code Greys at QAS triage; and at 19:15 and 19:34 Code Greys on the ED QAS ramp. Six of those fell between 06:00 and 14:00: a Code Grey, three adult MET calls (one cancelled within a minute) and two Neonatal MET calls.</w:t>
@@ -1706,7 +1706,7 @@
         <w:rPr>
           <w:b/>
         </w:rPr>
-        <w:t xml:space="preserve">(h)(iv) The codes on 19 March 2024, the day of the sick leave, as documented by the Appellant.</w:t>
+        <w:t xml:space="preserve">(h)(iv) The codes on 19 March 2024, the day of the sick leave.</w:t>
       </w:r>
       <w:r>
         <w:t xml:space="preserve"> Sick leave of 7.60 hours was taken that day. [¶ 235] The register records sixteen codes: at 0:17 a MET call to Ward MIU bed 21; at 1:41 a Code Grey in ED ambulatory care; at 9:27 a Paediatric MET call to Ward CIU bed 16; at 10:28 a simulation MET call to Ward 7C bed 3; at 11:30 a MET call to Ward 2I bed 20 and at 11:34 a MET call to the same bed, annotated "CALLED VIA SWITRCHBOARD" [sic]; at 12:36 a MET call to Ward 2I bed 12; at 13:42 a MET call to Ward 3DR bed 11; at 16:28 a MET call to Ward 3DR bed 11, cancelled at 16:29; at 16:48 a Code Grey in the ED mental health lounge; at 17:23 a MET call to Ward 3DR bed 11; at 17:31 a Code Grey in ED ambulatory care room 2; at 18:45 a MET call to Ward 5B bed 7; at 21:28 a Code Grey in the ED mental health lounge; and at 22:25 a Code Grey at ED QAS triage. Between 06:00 and 14:00 there were six: a Paediatric MET call, a simulation, and four adult MET calls, one of them recorded as called through the Switchboard.</w:t>
@@ -1717,7 +1717,7 @@
         <w:keepLines w:val="0"/>
       </w:pPr>
       <w:r>
-        <w:t xml:space="preserve">Paragraphs 228 to 231 of the notice to admit were not admitted. The entries above are documented by the Appellant from the register at Tab 31 and from the employer's own record of MET calls for 17 and 18 March 2024 [¶ 268], and he will prove them.</w:t>
+        <w:t xml:space="preserve">The entries are those recorded in the register at Tab 31. The employer holds its own record of the MET calls for 17 and 18 March 2024. [¶ 268]</w:t>
       </w:r>
     </w:p>
     <w:p>
@@ -1731,7 +1731,7 @@
         <w:t xml:space="preserve">(h)(v) The ordinary call load, and the Monday.</w:t>
       </w:r>
       <w:r>
-        <w:t xml:space="preserve"> The Appellant will give evidence, from his own monthly call statistics, that in the period of his graduated return in April 2025 he took between 269 and 444 calls on a single eight-hour shift, an average of about 360, and that the highest figure, 444, was on the one Monday afternoon shift in that sample (14 April 2025). He will give evidence that the Monday early shift is the peak of the week, because the weekend's backlog, the resumption of clinics and elective lists and the Monday admissions all arrive at the console together. The shift of 18 March 2024 was the Monday early shift, the first shift of the working week [¶ 227], and it followed a break of seven hours [¶ 284]. These matters are not admitted; they are the Appellant's own evidence and records, and will be proved by him.</w:t>
+        <w:t xml:space="preserve"> In April 2025, during the Appellant's graduated return, the console took between 269 and 444 calls on a single eight-hour shift, an average of about 360, on the monthly call statistics for that period; the highest figure, 444, was the one Monday afternoon shift in that period, 14 April 2025. The Monday early shift is the peak of the week: the weekend's backlog, the resumption of clinics and elective lists and the Monday admissions arrive at the console together. The shift of 18 March 2024 was the Monday early shift, the first shift of the working week [¶ 227], and it followed a break of seven hours. [¶ 284]</w:t>
       </w:r>
     </w:p>
     <w:p>

</xml_diff>